<commit_message>
Revision of Must Haves, and Proposal Form
</commit_message>
<xml_diff>
--- a/CodeLit - Proposal Form.docx
+++ b/CodeLit - Proposal Form.docx
@@ -67,12 +67,12 @@
             <wp:extent cx="733529" cy="730743"/>
             <wp:effectExtent b="0" l="0" r="0" t="0"/>
             <wp:wrapNone/>
-            <wp:docPr id="2" name="image2.png"/>
+            <wp:docPr id="2" name="image1.png"/>
             <a:graphic>
               <a:graphicData uri="http://schemas.openxmlformats.org/drawingml/2006/picture">
                 <pic:pic>
                   <pic:nvPicPr>
-                    <pic:cNvPr id="0" name="image2.png"/>
+                    <pic:cNvPr id="0" name="image1.png"/>
                     <pic:cNvPicPr preferRelativeResize="0"/>
                   </pic:nvPicPr>
                   <pic:blipFill>
@@ -109,12 +109,12 @@
             <wp:extent cx="683288" cy="714399"/>
             <wp:effectExtent b="0" l="0" r="0" t="0"/>
             <wp:wrapNone/>
-            <wp:docPr id="3" name="image1.png"/>
+            <wp:docPr id="3" name="image2.png"/>
             <a:graphic>
               <a:graphicData uri="http://schemas.openxmlformats.org/drawingml/2006/picture">
                 <pic:pic>
                   <pic:nvPicPr>
-                    <pic:cNvPr id="0" name="image1.png"/>
+                    <pic:cNvPr id="0" name="image2.png"/>
                     <pic:cNvPicPr preferRelativeResize="0"/>
                   </pic:nvPicPr>
                   <pic:blipFill>
@@ -1276,36 +1276,9 @@
                 <w:rFonts w:ascii="Arial" w:cs="Arial" w:eastAsia="Arial" w:hAnsi="Arial"/>
                 <w:rtl w:val="0"/>
               </w:rPr>
-              <w:t xml:space="preserve">CodeLit: A Windows Desktop and Web Application for Secure Exam Lockdown and</w:t>
-            </w:r>
-          </w:p>
-          <w:p>
-            <w:pPr>
-              <w:keepNext w:val="0"/>
-              <w:keepLines w:val="0"/>
-              <w:pageBreakBefore w:val="0"/>
-              <w:widowControl w:val="1"/>
-              <w:pBdr>
-                <w:top w:space="0" w:sz="0" w:val="nil"/>
-                <w:left w:space="0" w:sz="0" w:val="nil"/>
-                <w:bottom w:space="0" w:sz="0" w:val="nil"/>
-                <w:right w:space="0" w:sz="0" w:val="nil"/>
-                <w:between w:space="0" w:sz="0" w:val="nil"/>
-              </w:pBdr>
-              <w:shd w:fill="auto" w:val="clear"/>
-              <w:spacing w:after="0" w:before="0" w:line="240" w:lineRule="auto"/>
-              <w:ind w:left="0" w:right="0" w:firstLine="0"/>
-              <w:jc w:val="center"/>
-              <w:rPr>
-                <w:rFonts w:ascii="Arial" w:cs="Arial" w:eastAsia="Arial" w:hAnsi="Arial"/>
-              </w:rPr>
-            </w:pPr>
-            <w:r>
-              <w:rPr>
-                <w:rFonts w:ascii="Arial" w:cs="Arial" w:eastAsia="Arial" w:hAnsi="Arial"/>
-                <w:rtl w:val="0"/>
-              </w:rPr>
-              <w:t xml:space="preserve">Automated Programming Assessment in Philippine Computing Education </w:t>
+              <w:t xml:space="preserve">CodeLit: A Windows Desktop and Web Application for Automated</w:t>
+              <w:br w:type="textWrapping"/>
+              <w:t xml:space="preserve">Programming Assessment and Secure Exam Lockdown</w:t>
             </w:r>
             <w:r>
               <w:rPr>

</xml_diff>